<commit_message>
paper v2+: panel definition + audit-trail appendix
</commit_message>
<xml_diff>
--- a/paper/MEGA27-26b-immortal-jellyfish-genomics-v2.docx
+++ b/paper/MEGA27-26b-immortal-jellyfish-genomics-v2.docx
@@ -110,6 +110,19 @@
     <w:p>
       <w:r>
         <w:t>pytest validates parsers, GC/codon/k-mer math, signature distance bounds and copy-number signals on fixtures (7 tests); experiments/fetch_data.py rebuilds the sequence sets live from NCBI with rate limiting and resume; experiments/analyze.py regenerates every number in this paper from the fetched FASTAs.</w:t>
+      </w:r>
+    </w:p>
+    <w:p>
+      <w:pPr>
+        <w:pStyle w:val="Heading1"/>
+      </w:pPr>
+      <w:r>
+        <w:t>Appendix - panel definition and audit trail</w:t>
+      </w:r>
+    </w:p>
+    <w:p>
+      <w:r>
+        <w:t>Panel (locked before querying): base-excision and double-strand repair ERCC1, ERCC2, XRCC1, XRCC5, RAD51, BRCA1, MLH1, MSH2, OGG1, PARP1, FEN1, LIG4; telomerase pathway TERT, TERC, DKC1, POT1, TERF1, TERF2. The audit script logs every query term, database, and hit count to data/manifest.json; the negative for T. dohrnii is thus a logged protocol outcome, not an absence of effort. TERC is absent from protein-coding mRNA queries by design (it is a non-coding RNA) and is handled separately in the counts.</w:t>
       </w:r>
     </w:p>
     <w:p>

</xml_diff>